<commit_message>
Apply camera-in-U and room 204-206 to run sheet, scenario, packing list
Co-Authored-By: Claude Opus 5.5 <noreply@anthropic.com>
Claude-Session: https://claude.ai/code/session_017Giz7vfig8Fz5wHpNCoicZ
</commit_message>
<xml_diff>
--- a/reports/acdr2026_staff_deployment/進行シナリオ_0929/ACDR2026_Emcee_Run_Sheet_and_Briefing_draft1008.docx
+++ b/reports/acdr2026_staff_deployment/進行シナリオ_0929/ACDR2026_Emcee_Run_Sheet_and_Briefing_draft1008.docx
@@ -2722,7 +2722,7 @@
           <w:sz w:val="20"/>
           <w:szCs w:val="20"/>
         </w:rPr>
-        <w:t xml:space="preserve">Room: Peridot (Expo layout V4 of 1 October). Secretariat room: Tourmaline 207. Access from 08:00 on both days; no evening re-set. Furniture is the same on both days.</w:t>
+        <w:t>Room: Peridot 204-206 (Expo floor plan, 8 October). Secretariat room: Tourmaline 207. Access from 08:00 on both days; no evening re-set. Furniture is the same on both days.</w:t>
       </w:r>
     </w:p>
     <w:p>
@@ -2794,7 +2794,7 @@
           <w:sz w:val="20"/>
           <w:szCs w:val="20"/>
         </w:rPr>
-        <w:t xml:space="preserve">Side rows: 12 seats on the left and 8 on the right for second delegates and partner organisations; ADRC secretariat block of 8 seats next to the AV desk (front right). Classroom block of 30 (5 tables x 2 seats x 3 rows): Cabinet Office of Japan, City of Sendai, JAXA, BRIN, Google, Nepal, ADB, Tohoku University, JICA, ROK; two conference microphones only, on the City of Sendai Vice Mayor table and the Google table (they speak in the Roundtable). Theatre seating of 54 behind.</w:t>
+        <w:t>Side rows: 12 seats on each side for second delegates and partner organisations; ADRC secretariat (two tables) next to the AV desk (front right). Classroom block of 30 (5 tables x 2 seats x 3 rows): Cabinet Office of Japan, City of Sendai, JAXA, BRIN, Google, Nepal, ADB, Tohoku University, JICA, ROK; two conference microphones only, on the City of Sendai Vice Mayor table and the Google table (they speak in the Roundtable). Theatre seating of 40 behind.</w:t>
       </w:r>
     </w:p>
     <w:p>
@@ -3280,7 +3280,7 @@
           <w:sz w:val="20"/>
           <w:szCs w:val="20"/>
         </w:rPr>
-        <w:t>Zoom webinar hosted from the ADRC office in Kobe. One ADRC laptop at the AV desk sends room audio and video to Zoom. One camera at the back centre of the room (vendor camera with operator, or the ADRC camera; TBC). Online speakers, if any (UNDP/WMO, TBC), are shown on the screens by the AV operator.</w:t>
+        <w:t>Zoom webinar hosted from the ADRC office in Kobe. One ADRC laptop at the AV desk sends room audio and video to Zoom. One camera inside the U-shape (centre of the room) (vendor camera with operator, or the ADRC camera; TBC). Online speakers, if any (UNDP/WMO, TBC), are shown on the screens by the AV operator.</w:t>
       </w:r>
     </w:p>
     <w:p>

</xml_diff>